<commit_message>
add official Phase 2 result to report and presentation
</commit_message>
<xml_diff>
--- a/presentation/Huntrix_Presentation_Script.docx
+++ b/presentation/Huntrix_Presentation_Script.docx
@@ -1535,7 +1535,7 @@
           <w:color w:val="0F172A"/>
           <w:sz w:val="23"/>
         </w:rPr>
-        <w:t>We treated reproducibility as a result, not an administrative detail. The codebase had 249 automated tests, including 225 deterministic controls. The notebook reads the organizer's literal test path, loads pinned model, runtime, and evidence assets, and uses a fixed row, prompt, and batch schedule. One local llama.cpp server tensor-splits the model equally across the two T4 GPUs. The final validator preserves incoming IDs and writes exactly id and label. Three full runs produced byte-identical files, the frozen hash matched the scored CSV, and the organizer-run notebook validated 5,000 Phase 2 rows in 3 hours and 52 minutes. These checks establish execution integrity; they do not substitute for an unreleased Phase 2 accuracy score.</w:t>
+        <w:t>We treated reproducibility as a result, not an administrative detail. The codebase had 249 automated tests, including 225 deterministic controls. The notebook reads the organizer's literal test path, loads pinned model, runtime, and evidence assets, and uses a fixed row, prompt, and batch schedule. One local llama.cpp server tensor-splits the model equally across the two T4 GPUs. The final validator preserves incoming IDs and writes exactly id and label. Three full runs produced byte-identical files, the frozen hash matched the scored CSV, and the organizer-run notebook validated 5,000 Phase 2 rows in 3 hours and 52 minutes. These checks establish execution integrity. The later official score measures the aggregate outcome, but it still provides no row-level errors.</w:t>
       </w:r>
     </w:p>
     <w:tbl>
@@ -1637,7 +1637,7 @@
         <w:keepNext/>
       </w:pPr>
       <w:r>
-        <w:t>Slide 13: Phase 2 completed in 3 h 52 min with 95.9% judged</w:t>
+        <w:t>Slide 13: Phase 2 ranked 7/32 with an official score of 0.90144</w:t>
       </w:r>
     </w:p>
     <w:p>
@@ -1679,7 +1679,7 @@
           <w:color w:val="0F172A"/>
           <w:sz w:val="23"/>
         </w:rPr>
-        <w:t>The organizer-run Phase 2 notebook processed exactly 5,000 rows on two Tesla T4 GPUs. The router finished in 73.18 seconds but resolved only 207 rows, or 4.14 percent. The remaining 4,793 rows went to Qwen. The model was ready 171.25 seconds after the notebook started, and the judge stage took 13,747.50 seconds. End-to-end runtime was 13,921.91 seconds, which is 3 hours, 52 minutes, and 1.91 seconds. The output validation cell completed successfully with 5,000 ordered IDs and binary labels. This used 42.97 percent of the nine-hour budget. It is measured runtime evidence, not a Phase 2 accuracy score.</w:t>
+        <w:t>The organizer-run Phase 2 notebook processed exactly 5,000 rows on two Tesla T4 GPUs. The router finished in 73.18 seconds but resolved only 207 rows, or 4.14 percent. The remaining 4,793 rows went to Qwen. The model was ready 171.25 seconds after the notebook started, and the judge stage took 13,747.50 seconds. End-to-end runtime was 13,921.91 seconds, which is 3 hours, 52 minutes, and 1.91 seconds. The output validation cell completed successfully with 5,000 ordered IDs and binary labels. This used 42.97 percent of the nine-hour budget. The official standings later reported a score of 0.90144 and rank 7 of 32 teams. That is an aggregate result; the organizers did not release row-level labels.</w:t>
       </w:r>
     </w:p>
     <w:p>
@@ -1730,7 +1730,7 @@
           <w:color w:val="0F172A"/>
           <w:sz w:val="23"/>
         </w:rPr>
-        <w:t>Phase 2 changed the source distribution as expected. The organizer listed Common Crawl, recent newspapers, Wikipedia, Banglapedia, government service pages, Bangladesh law, NCTB textbooks, and literature. Deterministic coverage fell from 93.72 percent in Phase 1 to 4.14 percent in the held-out run. The router did not compensate by forcing approximate evidence. It abstained, and 95.86 percent of rows reached the fixed judge. That raised runtime to 3 hours and 52 minutes, but the notebook still finished with more than five hours of headroom. Accuracy remains an open question until the organizer provides a score.</w:t>
+        <w:t>Phase 2 changed the source distribution as expected. The organizer listed Common Crawl, recent newspapers, Wikipedia, Banglapedia, government service pages, Bangladesh law, NCTB textbooks, and literature. Deterministic coverage fell from 93.72 percent in Phase 1 to 4.14 percent in the held-out run. The router did not compensate by forcing approximate evidence. It abstained, and 95.86 percent of rows reached the fixed judge. That raised runtime to 3 hours and 52 minutes, but the notebook still finished with more than five hours of headroom. The official result was 0.90144 at rank 7 of 32. Because only aggregate standings were released, the remaining errors cannot yet be separated by source or routing branch.</w:t>
       </w:r>
     </w:p>
     <w:p>
@@ -1793,7 +1793,7 @@
           <w:color w:val="0F172A"/>
           <w:sz w:val="23"/>
         </w:rPr>
-        <w:t>We will close by separating supported findings from open questions. The experiments support three design choices: task families benefit from separate policies, predicate alignment reduces relation swaps, and explicit abstention keeps the pipeline safe when deterministic coverage falls. The main limitations are equally important. We had only 299 released labels, aggregate competition scores provide no row-level errors, and the Phase 2 accuracy result is still unknown. When those labels or analyses become available, the next work is to inspect the judged tail, recalibrate uncertain cases, and expand licensed evidence for civic and news domains. What we can already verify is reproducibility and runtime compliance. We are ready for your questions.</w:t>
+        <w:t>We will close by separating supported findings from open questions. The experiments support three design choices: task families benefit from separate policies, predicate alignment reduces relation swaps, and explicit abstention keeps the pipeline safe when deterministic coverage falls. The official Phase 2 score was 0.90144, placing Huntrix seventh among 32 teams, and the full run completed in 3 hours and 52 minutes. The limitations are equally important: we had only 299 released labels, the Phase 2 result is aggregate, and no row-level Phase 2 errors were released. If those labels become available, the next work is to inspect the judged tail, recalibrate uncertain cases, and expand licensed evidence for civic and news domains. We are ready for your questions.</w:t>
       </w:r>
     </w:p>
     <w:p>

</xml_diff>

<commit_message>
Adapt final talk for two presenters and ten-minute limit
</commit_message>
<xml_diff>
--- a/presentation/Huntrix_Presentation_Script.docx
+++ b/presentation/Huntrix_Presentation_Script.docx
@@ -15,7 +15,7 @@
           <w:color w:val="D59B32"/>
           <w:sz w:val="22"/>
         </w:rPr>
-        <w:t>FINAL ROUND • 15-SLIDE TALK</w:t>
+        <w:t>FINAL ROUND • 10-MINUTE TALK</w:t>
       </w:r>
     </w:p>
     <w:p>
@@ -99,7 +99,7 @@
                 <w:color w:val="0F172A"/>
                 <w:sz w:val="21"/>
               </w:rPr>
-              <w:t>Approximately 14 minutes, 35 seconds across four presenters. Rehearse to about 14 minutes to preserve pause and handoff time.</w:t>
+              <w:t>Rehearsed content: 9 minutes 15 seconds across two presenters, with one handoff and 45 seconds of safety before the 10-minute hard stop.</w:t>
             </w:r>
           </w:p>
         </w:tc>
@@ -123,7 +123,7 @@
           <w:color w:val="0F172A"/>
           <w:sz w:val="21"/>
         </w:rPr>
-        <w:t>Touhidul Alam Seyam  •  MD. Abtahee Kabir  •  Joyeta Barua Moni  •  Noore Tamanna Orny</w:t>
+        <w:t>Touhidul Alam Seyam  •  MD. Abtahee Kabir</w:t>
       </w:r>
     </w:p>
     <w:p>
@@ -308,7 +308,7 @@
                 <w:color w:val="0F172A"/>
                 <w:sz w:val="20"/>
               </w:rPr>
-              <w:t>1-4</w:t>
+              <w:t>1-7</w:t>
             </w:r>
           </w:p>
         </w:tc>
@@ -325,7 +325,7 @@
                 <w:color w:val="0F172A"/>
                 <w:sz w:val="20"/>
               </w:rPr>
-              <w:t>3 min 35 sec</w:t>
+              <w:t>4 min 15 sec</w:t>
             </w:r>
           </w:p>
         </w:tc>
@@ -342,7 +342,7 @@
                 <w:color w:val="0F172A"/>
                 <w:sz w:val="20"/>
               </w:rPr>
-              <w:t>Problem, hypothesis, router</w:t>
+              <w:t>Problem, router, solvers, claim verification</w:t>
             </w:r>
           </w:p>
         </w:tc>
@@ -381,7 +381,7 @@
                 <w:color w:val="0F172A"/>
                 <w:sz w:val="20"/>
               </w:rPr>
-              <w:t>5-8</w:t>
+              <w:t>8-15</w:t>
             </w:r>
           </w:p>
         </w:tc>
@@ -398,7 +398,7 @@
                 <w:color w:val="0F172A"/>
                 <w:sz w:val="20"/>
               </w:rPr>
-              <w:t>4 min 5 sec</w:t>
+              <w:t>5 min 00 sec</w:t>
             </w:r>
           </w:p>
         </w:tc>
@@ -415,153 +415,7 @@
                 <w:color w:val="0F172A"/>
                 <w:sz w:val="20"/>
               </w:rPr>
-              <w:t>Structured solvers and judge</w:t>
-            </w:r>
-          </w:p>
-        </w:tc>
-      </w:tr>
-      <w:tr>
-        <w:trPr>
-          <w:cantSplit/>
-        </w:trPr>
-        <w:tc>
-          <w:tcPr>
-            <w:tcW w:type="dxa" w:w="2900"/>
-          </w:tcPr>
-          <w:p>
-            <w:r>
-              <w:rPr>
-                <w:rFonts w:ascii="Calibri" w:hAnsi="Calibri" w:eastAsia="Calibri"/>
-                <w:b w:val="0"/>
-                <w:i w:val="0"/>
-                <w:color w:val="0F172A"/>
-                <w:sz w:val="20"/>
-              </w:rPr>
-              <w:t>Joyeta Barua Moni</w:t>
-            </w:r>
-          </w:p>
-        </w:tc>
-        <w:tc>
-          <w:tcPr>
-            <w:tcW w:type="dxa" w:w="1700"/>
-          </w:tcPr>
-          <w:p>
-            <w:r>
-              <w:rPr>
-                <w:rFonts w:ascii="Calibri" w:hAnsi="Calibri" w:eastAsia="Calibri"/>
-                <w:b w:val="0"/>
-                <w:i w:val="0"/>
-                <w:color w:val="0F172A"/>
-                <w:sz w:val="20"/>
-              </w:rPr>
-              <w:t>9-12</w:t>
-            </w:r>
-          </w:p>
-        </w:tc>
-        <w:tc>
-          <w:tcPr>
-            <w:tcW w:type="dxa" w:w="1700"/>
-          </w:tcPr>
-          <w:p>
-            <w:r>
-              <w:rPr>
-                <w:rFonts w:ascii="Calibri" w:hAnsi="Calibri" w:eastAsia="Calibri"/>
-                <w:b w:val="0"/>
-                <w:i w:val="0"/>
-                <w:color w:val="0F172A"/>
-                <w:sz w:val="20"/>
-              </w:rPr>
-              <w:t>4 min 5 sec</w:t>
-            </w:r>
-          </w:p>
-        </w:tc>
-        <w:tc>
-          <w:tcPr>
-            <w:tcW w:type="dxa" w:w="3060"/>
-          </w:tcPr>
-          <w:p>
-            <w:r>
-              <w:rPr>
-                <w:rFonts w:ascii="Calibri" w:hAnsi="Calibri" w:eastAsia="Calibri"/>
-                <w:b w:val="0"/>
-                <w:i w:val="0"/>
-                <w:color w:val="0F172A"/>
-                <w:sz w:val="20"/>
-              </w:rPr>
-              <w:t>Evidence, experiments, reproducibility</w:t>
-            </w:r>
-          </w:p>
-        </w:tc>
-      </w:tr>
-      <w:tr>
-        <w:trPr>
-          <w:cantSplit/>
-        </w:trPr>
-        <w:tc>
-          <w:tcPr>
-            <w:tcW w:type="dxa" w:w="2900"/>
-          </w:tcPr>
-          <w:p>
-            <w:r>
-              <w:rPr>
-                <w:rFonts w:ascii="Calibri" w:hAnsi="Calibri" w:eastAsia="Calibri"/>
-                <w:b w:val="0"/>
-                <w:i w:val="0"/>
-                <w:color w:val="0F172A"/>
-                <w:sz w:val="20"/>
-              </w:rPr>
-              <w:t>Noore Tamanna Orny</w:t>
-            </w:r>
-          </w:p>
-        </w:tc>
-        <w:tc>
-          <w:tcPr>
-            <w:tcW w:type="dxa" w:w="1700"/>
-          </w:tcPr>
-          <w:p>
-            <w:r>
-              <w:rPr>
-                <w:rFonts w:ascii="Calibri" w:hAnsi="Calibri" w:eastAsia="Calibri"/>
-                <w:b w:val="0"/>
-                <w:i w:val="0"/>
-                <w:color w:val="0F172A"/>
-                <w:sz w:val="20"/>
-              </w:rPr>
-              <w:t>13-15</w:t>
-            </w:r>
-          </w:p>
-        </w:tc>
-        <w:tc>
-          <w:tcPr>
-            <w:tcW w:type="dxa" w:w="1700"/>
-          </w:tcPr>
-          <w:p>
-            <w:r>
-              <w:rPr>
-                <w:rFonts w:ascii="Calibri" w:hAnsi="Calibri" w:eastAsia="Calibri"/>
-                <w:b w:val="0"/>
-                <w:i w:val="0"/>
-                <w:color w:val="0F172A"/>
-                <w:sz w:val="20"/>
-              </w:rPr>
-              <w:t>2 min 50 sec</w:t>
-            </w:r>
-          </w:p>
-        </w:tc>
-        <w:tc>
-          <w:tcPr>
-            <w:tcW w:type="dxa" w:w="3060"/>
-          </w:tcPr>
-          <w:p>
-            <w:r>
-              <w:rPr>
-                <w:rFonts w:ascii="Calibri" w:hAnsi="Calibri" w:eastAsia="Calibri"/>
-                <w:b w:val="0"/>
-                <w:i w:val="0"/>
-                <w:color w:val="0F172A"/>
-                <w:sz w:val="20"/>
-              </w:rPr>
-              <w:t>Phase 2 runtime, shift, close</w:t>
+              <w:t>Judge, evidence, experiments, Phase 2, close</w:t>
             </w:r>
           </w:p>
         </w:tc>
@@ -750,7 +604,7 @@
           <w:color w:val="D59B32"/>
           <w:sz w:val="20"/>
         </w:rPr>
-        <w:t xml:space="preserve">     Target  45 seconds</w:t>
+        <w:t xml:space="preserve">     Target  30 seconds</w:t>
       </w:r>
     </w:p>
     <w:p>
@@ -766,7 +620,7 @@
           <w:color w:val="0F172A"/>
           <w:sz w:val="23"/>
         </w:rPr>
-        <w:t>Good morning. We are Team Huntrix. This talk is about a research question rather than a leaderboard position: when is a Bengali hallucination decision exact enough for a deterministic method, and when should the system abstain to a language-model judge? We will show how that question changed our architecture, which experiments failed, how the decision log shaped later versions, and what the organizer-run Phase 2 notebook revealed about source shift. The final score appears later as one evaluation view, alongside local tests, reproducibility checks, and runtime evidence.</w:t>
+        <w:t>Good morning. We are Team Huntrix. Our question was simple: when is a Bengali hallucination decision exact enough for a deterministic method, and when should the system abstain to a language-model judge? We will show the architecture that emerged, the experiments that changed it, and what the organizer-run Phase 2 evaluation revealed about generalization and runtime.</w:t>
       </w:r>
     </w:p>
     <w:p>
@@ -801,7 +655,7 @@
           <w:color w:val="D59B32"/>
           <w:sz w:val="20"/>
         </w:rPr>
-        <w:t xml:space="preserve">     Target  50 seconds</w:t>
+        <w:t xml:space="preserve">     Target  35 seconds</w:t>
       </w:r>
     </w:p>
     <w:p>
@@ -817,7 +671,7 @@
           <w:color w:val="0F172A"/>
           <w:sz w:val="23"/>
         </w:rPr>
-        <w:t>The label looked simple: zero for hallucinated and one for faithful. The rows were not simple. Some asked whether a response followed a supplied passage. Others needed arithmetic, option parsing, Bengali morphology, idiom meaning, legal sections, or a historical fact. One generic judge prompt had to switch between all of these without being told which evidence standard to use. It gave us a useful baseline, but it also created a ceiling. A response could sound reasonable while answering the wrong relation. That pushed us toward task routing.</w:t>
+        <w:t>The output was binary, but the reasoning was not. Some rows required context entailment; others required arithmetic, option parsing, morphology, idioms, law, history, or literature. A single generic prompt applied one evidence policy to every task. It produced a useful baseline, but it also confused a related fact with an answer to the requested relation. That observation led us from uniform judging to task routing.</w:t>
       </w:r>
     </w:p>
     <w:p>
@@ -852,7 +706,7 @@
           <w:color w:val="D59B32"/>
           <w:sz w:val="20"/>
         </w:rPr>
-        <w:t xml:space="preserve">     Target  55 seconds</w:t>
+        <w:t xml:space="preserve">     Target  40 seconds</w:t>
       </w:r>
     </w:p>
     <w:p>
@@ -868,7 +722,12 @@
           <w:color w:val="0F172A"/>
           <w:sz w:val="23"/>
         </w:rPr>
-        <w:t>Our fix was a selective cascade. We normalize the row, identify its task family, and try only the rules that belong to that family. The technical contribution is the combination of selective routing, small task solvers, claim-level verification, typed provenance, and an offline two-T4 fallback. Exact lineage can decide an exact source match. Structured solvers can decide a parsed number or option. Context checks can decide a contradiction inside the supplied passage. Each stage can also return nothing. If the source is only similar, or the relation is unclear, the row reaches the judge. The next slide opens this router and shows the actual branch conditions.</w:t>
+        <w:t>This is the final selective cascade, matching Figure 1 in our paper. We normalize the row, then try exact lineage, structured solvers, context verification, and typed evidence. Each deterministic branch may return zero, one, or abstain. A label is emitted only when the source and requested relation align. Unresolved rows reach the fixed Qwen judge. The important design choice is that abstention is a valid outcome, not a failure.</w:t>
+      </w:r>
+    </w:p>
+    <w:p>
+      <w:r>
+        <w:br w:type="page"/>
       </w:r>
     </w:p>
     <w:p>
@@ -903,7 +762,7 @@
           <w:color w:val="D59B32"/>
           <w:sz w:val="20"/>
         </w:rPr>
-        <w:t xml:space="preserve">     Target  65 seconds</w:t>
+        <w:t xml:space="preserve">     Target  40 seconds</w:t>
       </w:r>
     </w:p>
     <w:p>
@@ -919,7 +778,165 @@
           <w:color w:val="0F172A"/>
           <w:sz w:val="23"/>
         </w:rPr>
-        <w:t>This is the router in operational form. After normalization, the first question is whether the row contains an answer-bearing context. If it does, the context verifier compares atomic claims. Without context, the router checks for a structured task such as a number, range, option, or morphology problem. The next branch asks whether an exact source lineage exists. Even then, typed evidence must match the entity, predicate, and value. A conflict between sources of equal trust forces abstention. Every branch has the same contract: return zero, one, or null. Null is not an error. It sends the row forward. Only the final unresolved tail reaches the LLM judge.</w:t>
+        <w:t>The router first separates answer-bearing context from no-context tasks. Context rows go to claim verification. No-context rows may enter numeric, multiple-choice, morphology, lineage, or typed-evidence paths. Every route uses the same contract: return a label with provenance, or return null. Approximate retrieval can propose a candidate, but it cannot force a verdict. Ambiguity or equal-trust conflict therefore moves forward instead of contaminating deterministic decisions.</w:t>
+      </w:r>
+    </w:p>
+    <w:p>
+      <w:pPr>
+        <w:pStyle w:val="Heading2"/>
+        <w:keepNext/>
+      </w:pPr>
+      <w:r>
+        <w:t>Slide 5: Structured solvers shared one decision contract</w:t>
+      </w:r>
+    </w:p>
+    <w:p>
+      <w:pPr>
+        <w:keepNext/>
+        <w:spacing w:after="120"/>
+      </w:pPr>
+      <w:r>
+        <w:rPr>
+          <w:rFonts w:ascii="Calibri" w:hAnsi="Calibri" w:eastAsia="Calibri"/>
+          <w:b/>
+          <w:i w:val="0"/>
+          <w:color w:val="2A8C82"/>
+          <w:sz w:val="20"/>
+        </w:rPr>
+        <w:t>Presenter  Touhidul Alam Seyam</w:t>
+      </w:r>
+      <w:r>
+        <w:rPr>
+          <w:rFonts w:ascii="Calibri" w:hAnsi="Calibri" w:eastAsia="Calibri"/>
+          <w:b/>
+          <w:i w:val="0"/>
+          <w:color w:val="D59B32"/>
+          <w:sz w:val="20"/>
+        </w:rPr>
+        <w:t xml:space="preserve">     Target  35 seconds</w:t>
+      </w:r>
+    </w:p>
+    <w:p>
+      <w:pPr>
+        <w:keepLines/>
+        <w:spacing w:after="140" w:line="300" w:lineRule="auto"/>
+      </w:pPr>
+      <w:r>
+        <w:rPr>
+          <w:rFonts w:ascii="Calibri" w:hAnsi="Calibri" w:eastAsia="Calibri"/>
+          <w:b w:val="0"/>
+          <w:i w:val="0"/>
+          <w:color w:val="0F172A"/>
+          <w:sz w:val="23"/>
+        </w:rPr>
+        <w:t>The deterministic layer was a set of small task-specific parsers, not one keyword system. Numeric rules normalized Bengali digits, units, dates, and ranges. Multiple-choice rules mapped answer aliases. Morphology rules checked the requested grammatical form, while idiom rules separated literal and figurative meaning. Despite different parsing logic, every solver returned the same fields: entity, predicate, value, source, and verdict. Missing or conflicting fields produced abstention.</w:t>
+      </w:r>
+    </w:p>
+    <w:p>
+      <w:pPr>
+        <w:pStyle w:val="Heading2"/>
+        <w:keepNext/>
+      </w:pPr>
+      <w:r>
+        <w:t>Slide 6: A correct fact can still answer the wrong relation</w:t>
+      </w:r>
+    </w:p>
+    <w:p>
+      <w:pPr>
+        <w:keepNext/>
+        <w:spacing w:after="120"/>
+      </w:pPr>
+      <w:r>
+        <w:rPr>
+          <w:rFonts w:ascii="Calibri" w:hAnsi="Calibri" w:eastAsia="Calibri"/>
+          <w:b/>
+          <w:i w:val="0"/>
+          <w:color w:val="2A8C82"/>
+          <w:sz w:val="20"/>
+        </w:rPr>
+        <w:t>Presenter  Touhidul Alam Seyam</w:t>
+      </w:r>
+      <w:r>
+        <w:rPr>
+          <w:rFonts w:ascii="Calibri" w:hAnsi="Calibri" w:eastAsia="Calibri"/>
+          <w:b/>
+          <w:i w:val="0"/>
+          <w:color w:val="D59B32"/>
+          <w:sz w:val="20"/>
+        </w:rPr>
+        <w:t xml:space="preserve">     Target  35 seconds</w:t>
+      </w:r>
+    </w:p>
+    <w:p>
+      <w:pPr>
+        <w:keepLines/>
+        <w:spacing w:after="140" w:line="300" w:lineRule="auto"/>
+      </w:pPr>
+      <w:r>
+        <w:rPr>
+          <w:rFonts w:ascii="Calibri" w:hAnsi="Calibri" w:eastAsia="Calibri"/>
+          <w:b w:val="0"/>
+          <w:i w:val="0"/>
+          <w:color w:val="0F172A"/>
+          <w:sz w:val="23"/>
+        </w:rPr>
+        <w:t>This example explains the predicate guard. The passage says that *Runway* was released in 2010. The prompt asks for the release year, but the response gives the film title. The response is related to the correct entity, yet its semantic type is wrong: a title is not a year. Similarity-based retrieval may accept it; our relation check emits label zero.</w:t>
+      </w:r>
+    </w:p>
+    <w:p>
+      <w:r>
+        <w:br w:type="page"/>
+      </w:r>
+    </w:p>
+    <w:p>
+      <w:pPr>
+        <w:pStyle w:val="Heading2"/>
+        <w:keepNext/>
+      </w:pPr>
+      <w:r>
+        <w:t>Slide 7: Context rows were reduced to claim-level entailment tests</w:t>
+      </w:r>
+    </w:p>
+    <w:p>
+      <w:pPr>
+        <w:keepNext/>
+        <w:spacing w:after="120"/>
+      </w:pPr>
+      <w:r>
+        <w:rPr>
+          <w:rFonts w:ascii="Calibri" w:hAnsi="Calibri" w:eastAsia="Calibri"/>
+          <w:b/>
+          <w:i w:val="0"/>
+          <w:color w:val="2A8C82"/>
+          <w:sz w:val="20"/>
+        </w:rPr>
+        <w:t>Presenter  Touhidul Alam Seyam</w:t>
+      </w:r>
+      <w:r>
+        <w:rPr>
+          <w:rFonts w:ascii="Calibri" w:hAnsi="Calibri" w:eastAsia="Calibri"/>
+          <w:b/>
+          <w:i w:val="0"/>
+          <w:color w:val="D59B32"/>
+          <w:sz w:val="20"/>
+        </w:rPr>
+        <w:t xml:space="preserve">     Target  40 seconds</w:t>
+      </w:r>
+    </w:p>
+    <w:p>
+      <w:pPr>
+        <w:keepLines/>
+        <w:spacing w:after="140" w:line="300" w:lineRule="auto"/>
+      </w:pPr>
+      <w:r>
+        <w:rPr>
+          <w:rFonts w:ascii="Calibri" w:hAnsi="Calibri" w:eastAsia="Calibri"/>
+          <w:b w:val="0"/>
+          <w:i w:val="0"/>
+          <w:color w:val="0F172A"/>
+          <w:sz w:val="23"/>
+        </w:rPr>
+        <w:t>For context rows, we split the passage into clauses and the response into atomic claims. Entity, number, negation, and predicate anchors select the applicable clause. Each claim becomes supported, contradicted, or unknown. One contradiction is enough for label zero. Label one requires every factual claim to be supported with no unsupported addition. Everything between those cases abstains. This catches responses that copy most of the passage but alter one decisive fact.</w:t>
       </w:r>
     </w:p>
     <w:tbl>
@@ -969,7 +986,7 @@
                 <w:color w:val="0F172A"/>
                 <w:sz w:val="21"/>
               </w:rPr>
-              <w:t>Abtahee will open the structured and relation-verification paths.</w:t>
+              <w:t>Abtahee will cover the fallback judge, evidence gates, experiment history, and Phase 2 result.</w:t>
             </w:r>
           </w:p>
         </w:tc>
@@ -1021,164 +1038,6 @@
         <w:keepNext/>
       </w:pPr>
       <w:r>
-        <w:t>Slide 5: Structured solvers shared one decision contract</w:t>
-      </w:r>
-    </w:p>
-    <w:p>
-      <w:pPr>
-        <w:keepNext/>
-        <w:spacing w:after="120"/>
-      </w:pPr>
-      <w:r>
-        <w:rPr>
-          <w:rFonts w:ascii="Calibri" w:hAnsi="Calibri" w:eastAsia="Calibri"/>
-          <w:b/>
-          <w:i w:val="0"/>
-          <w:color w:val="2A8C82"/>
-          <w:sz w:val="20"/>
-        </w:rPr>
-        <w:t>Presenter  MD. Abtahee Kabir</w:t>
-      </w:r>
-      <w:r>
-        <w:rPr>
-          <w:rFonts w:ascii="Calibri" w:hAnsi="Calibri" w:eastAsia="Calibri"/>
-          <w:b/>
-          <w:i w:val="0"/>
-          <w:color w:val="D59B32"/>
-          <w:sz w:val="20"/>
-        </w:rPr>
-        <w:t xml:space="preserve">     Target  60 seconds</w:t>
-      </w:r>
-    </w:p>
-    <w:p>
-      <w:pPr>
-        <w:keepLines/>
-        <w:spacing w:after="140" w:line="300" w:lineRule="auto"/>
-      </w:pPr>
-      <w:r>
-        <w:rPr>
-          <w:rFonts w:ascii="Calibri" w:hAnsi="Calibri" w:eastAsia="Calibri"/>
-          <w:b w:val="0"/>
-          <w:i w:val="0"/>
-          <w:color w:val="0F172A"/>
-          <w:sz w:val="23"/>
-        </w:rPr>
-        <w:t>The deterministic branch was not one large collection of keywords. It contained separate parsers with the same output contract. The numeric solver normalized Bengali digits, units, dates, and ranges before checking the exact comparison requested. The multiple-choice solver extracted the option set, mapped aliases, and verified that the response selected a valid option. The morphology solver identified the requested form and compared the root, suffix, or grammatical class. Idiom and lexical rows first distinguished literal from figurative meaning. All four produced an entity, predicate, parsed value, source, and verdict. If any required field was missing or contradictory, the solver returned null. This shared contract made the router testable even though the parsers were task-specific.</w:t>
-      </w:r>
-    </w:p>
-    <w:p>
-      <w:pPr>
-        <w:pStyle w:val="Heading2"/>
-        <w:keepNext/>
-      </w:pPr>
-      <w:r>
-        <w:t>Slide 6: A correct fact can still answer the wrong relation</w:t>
-      </w:r>
-    </w:p>
-    <w:p>
-      <w:pPr>
-        <w:keepNext/>
-        <w:spacing w:after="120"/>
-      </w:pPr>
-      <w:r>
-        <w:rPr>
-          <w:rFonts w:ascii="Calibri" w:hAnsi="Calibri" w:eastAsia="Calibri"/>
-          <w:b/>
-          <w:i w:val="0"/>
-          <w:color w:val="2A8C82"/>
-          <w:sz w:val="20"/>
-        </w:rPr>
-        <w:t>Presenter  MD. Abtahee Kabir</w:t>
-      </w:r>
-      <w:r>
-        <w:rPr>
-          <w:rFonts w:ascii="Calibri" w:hAnsi="Calibri" w:eastAsia="Calibri"/>
-          <w:b/>
-          <w:i w:val="0"/>
-          <w:color w:val="D59B32"/>
-          <w:sz w:val="20"/>
-        </w:rPr>
-        <w:t xml:space="preserve">     Target  65 seconds</w:t>
-      </w:r>
-    </w:p>
-    <w:p>
-      <w:pPr>
-        <w:keepLines/>
-        <w:spacing w:after="140" w:line="300" w:lineRule="auto"/>
-      </w:pPr>
-      <w:r>
-        <w:rPr>
-          <w:rFonts w:ascii="Calibri" w:hAnsi="Calibri" w:eastAsia="Calibri"/>
-          <w:b w:val="0"/>
-          <w:i w:val="0"/>
-          <w:color w:val="0F172A"/>
-          <w:sz w:val="23"/>
-        </w:rPr>
-        <w:t>This released example shows why semantic similarity was not enough. The context says that Tareque Masud's latest feature film was Runway and that it was released in 2010. The prompt asks when the film was released. The response says Runway. That is a correct title and the correct entity, but it has the wrong semantic type. The expected predicate is release year, while the response supplies a film title. A retrieval system may see a highly related answer. Our relation gate rejects it and emits label zero. This is the concrete failure mode that motivated the predicate field used in later slides.</w:t>
-      </w:r>
-    </w:p>
-    <w:p>
-      <w:pPr>
-        <w:pStyle w:val="Heading2"/>
-        <w:keepNext/>
-      </w:pPr>
-      <w:r>
-        <w:t>Slide 7: Context rows were reduced to claim-level entailment tests</w:t>
-      </w:r>
-    </w:p>
-    <w:p>
-      <w:pPr>
-        <w:keepNext/>
-        <w:spacing w:after="120"/>
-      </w:pPr>
-      <w:r>
-        <w:rPr>
-          <w:rFonts w:ascii="Calibri" w:hAnsi="Calibri" w:eastAsia="Calibri"/>
-          <w:b/>
-          <w:i w:val="0"/>
-          <w:color w:val="2A8C82"/>
-          <w:sz w:val="20"/>
-        </w:rPr>
-        <w:t>Presenter  MD. Abtahee Kabir</w:t>
-      </w:r>
-      <w:r>
-        <w:rPr>
-          <w:rFonts w:ascii="Calibri" w:hAnsi="Calibri" w:eastAsia="Calibri"/>
-          <w:b/>
-          <w:i w:val="0"/>
-          <w:color w:val="D59B32"/>
-          <w:sz w:val="20"/>
-        </w:rPr>
-        <w:t xml:space="preserve">     Target  65 seconds</w:t>
-      </w:r>
-    </w:p>
-    <w:p>
-      <w:pPr>
-        <w:keepLines/>
-        <w:spacing w:after="140" w:line="300" w:lineRule="auto"/>
-      </w:pPr>
-      <w:r>
-        <w:rPr>
-          <w:rFonts w:ascii="Calibri" w:hAnsi="Calibri" w:eastAsia="Calibri"/>
-          <w:b w:val="0"/>
-          <w:i w:val="0"/>
-          <w:color w:val="0F172A"/>
-          <w:sz w:val="23"/>
-        </w:rPr>
-        <w:t>This is the expanded view of Figure 2a in the report. For context rows, raw similarity was not the decision variable. We split the context into clauses and the response into atomic factual claims. Alignment used anchors such as named entities, numbers, negation, and the requested relation. Each claim then received one of three states: supported, contradicted, or unknown. A single contradiction was enough for label zero. Label one required support for every factual claim and no unsupported addition. Anything between those cases produced abstention and moved to the judge. This claim-level rule matters when most of a response copies the context but changes one year, person, quantity, or polarity.</w:t>
-      </w:r>
-    </w:p>
-    <w:p>
-      <w:r>
-        <w:br w:type="page"/>
-      </w:r>
-    </w:p>
-    <w:p>
-      <w:pPr>
-        <w:pStyle w:val="Heading2"/>
-        <w:keepNext/>
-      </w:pPr>
-      <w:r>
         <w:t>Slide 8: Qwen judged 158 rows, not the whole test set</w:t>
       </w:r>
     </w:p>
@@ -1205,7 +1064,7 @@
           <w:color w:val="D59B32"/>
           <w:sz w:val="20"/>
         </w:rPr>
-        <w:t xml:space="preserve">     Target  55 seconds</w:t>
+        <w:t xml:space="preserve">     Target  35 seconds</w:t>
       </w:r>
     </w:p>
     <w:p>
@@ -1221,100 +1080,7 @@
           <w:color w:val="0F172A"/>
           <w:sz w:val="23"/>
         </w:rPr>
-        <w:t>The fallback used Qwen3.6 27B in a 16.332 GiB quantized checkpoint. Context rows received one entailment view. No-context rows received up to three short views: a factual check, strict exam grading, and a check that was deliberately cautious about faithful labels. A no-context response needed unanimous positive votes to receive label one. The first zero ended evaluation early. We disabled thinking and constrained generation to one binary token. Row order, prompt order, seeds, and batch boundaries were fixed. That made the judge fast enough to be a tail component rather than the whole system.</w:t>
-      </w:r>
-    </w:p>
-    <w:tbl>
-      <w:tblPr>
-        <w:tblW w:type="dxa" w:w="9360"/>
-        <w:jc w:val="left"/>
-        <w:tblLayout w:type="fixed"/>
-        <w:tblLook w:firstColumn="1" w:firstRow="1" w:lastColumn="0" w:lastRow="0" w:noHBand="0" w:noVBand="1" w:val="04A0"/>
-        <w:tblInd w:w="120" w:type="dxa"/>
-      </w:tblPr>
-      <w:tblGrid>
-        <w:gridCol w:w="9360"/>
-      </w:tblGrid>
-      <w:tr>
-        <w:tc>
-          <w:tcPr>
-            <w:tcW w:type="dxa" w:w="9360"/>
-            <w:tcMar>
-              <w:top w:w="100" w:type="dxa"/>
-              <w:start w:w="120" w:type="dxa"/>
-              <w:bottom w:w="100" w:type="dxa"/>
-              <w:end w:w="120" w:type="dxa"/>
-            </w:tcMar>
-            <w:vAlign w:val="center"/>
-            <w:shd w:fill="DDF2EE"/>
-          </w:tcPr>
-          <w:p>
-            <w:pPr>
-              <w:spacing w:after="40"/>
-            </w:pPr>
-            <w:r>
-              <w:rPr>
-                <w:rFonts w:ascii="Calibri" w:hAnsi="Calibri" w:eastAsia="Calibri"/>
-                <w:b/>
-                <w:i w:val="0"/>
-                <w:color w:val="2A8C82"/>
-                <w:sz w:val="21"/>
-              </w:rPr>
-              <w:t>Handoff</w:t>
-              <w:br/>
-            </w:r>
-            <w:r>
-              <w:rPr>
-                <w:rFonts w:ascii="Calibri" w:hAnsi="Calibri" w:eastAsia="Calibri"/>
-                <w:b w:val="0"/>
-                <w:i w:val="0"/>
-                <w:color w:val="0F172A"/>
-                <w:sz w:val="21"/>
-              </w:rPr>
-              <w:t>Joyeta will show how accepted evidence was traced, then connect that design to the experiments and final result.</w:t>
-            </w:r>
-          </w:p>
-        </w:tc>
-      </w:tr>
-    </w:tbl>
-    <w:p>
-      <w:pPr>
-        <w:spacing w:after="20"/>
-      </w:pPr>
-    </w:p>
-    <w:p>
-      <w:r>
-        <w:br w:type="page"/>
-      </w:r>
-    </w:p>
-    <w:p>
-      <w:pPr>
-        <w:spacing w:after="60"/>
-      </w:pPr>
-      <w:r>
-        <w:rPr>
-          <w:rFonts w:ascii="Calibri" w:hAnsi="Calibri" w:eastAsia="Calibri"/>
-          <w:b/>
-          <w:i w:val="0"/>
-          <w:color w:val="D59B32"/>
-          <w:sz w:val="20"/>
-        </w:rPr>
-        <w:t>PRESENTER BLOCK</w:t>
-      </w:r>
-    </w:p>
-    <w:p>
-      <w:pPr>
-        <w:spacing w:after="200"/>
-      </w:pPr>
-      <w:r>
-        <w:rPr>
-          <w:rFonts w:ascii="Calibri" w:hAnsi="Calibri" w:eastAsia="Calibri"/>
-          <w:b/>
-          <w:i w:val="0"/>
-          <w:color w:val="0F172A"/>
-          <w:sz w:val="44"/>
-        </w:rPr>
-        <w:t>Joyeta Barua Moni</w:t>
+        <w:t>The Phase 1 fallback used quantized Qwen3.6-27B across two T4 GPUs. Context rows received one entailment view. No-context rows received up to three short checks and required unanimous positive votes for label one. Thinking was disabled and generation was constrained to one binary token. Fixed row order, prompt order, seeds, and batches made the judge deterministic. In Phase 1, only 158 unresolved rows reached it.</w:t>
       </w:r>
     </w:p>
     <w:p>
@@ -1339,7 +1105,7 @@
           <w:color w:val="2A8C82"/>
           <w:sz w:val="20"/>
         </w:rPr>
-        <w:t>Presenter  Joyeta Barua Moni</w:t>
+        <w:t>Presenter  MD. Abtahee Kabir</w:t>
       </w:r>
       <w:r>
         <w:rPr>
@@ -1349,7 +1115,7 @@
           <w:color w:val="D59B32"/>
           <w:sz w:val="20"/>
         </w:rPr>
-        <w:t xml:space="preserve">     Target  65 seconds</w:t>
+        <w:t xml:space="preserve">     Target  40 seconds</w:t>
       </w:r>
     </w:p>
     <w:p>
@@ -1365,7 +1131,7 @@
           <w:color w:val="0F172A"/>
           <w:sz w:val="23"/>
         </w:rPr>
-        <w:t>This is the expanded view of Figure 2b in the report. Every deterministic fact was stored as a typed evidence record. The record carried a source identifier, source family, normalized entity, predicate, value, and provenance. At prediction time, four gates had to pass. The entity had to match. The requested predicate had to match, not merely appear near the same topic. The value needed exact or task-specific equivalence. Finally, no source of equal trust could contradict it. The resulting trace recorded the route, source, predicate, and verdict. If any gate failed, the verdict was null and the row moved forward. This trace made error analysis possible without storing a manual label vector for the test set.</w:t>
+        <w:t>This is Figure 2b from the paper. A candidate fact carried its provenance, entity, predicate, and value. It could decide a row only if four gates passed: the entity matched, the requested predicate matched, the value was equivalent, and no equal-trust source contradicted it. Any failed gate returned abstention. This prevented a relevant source from answering a neighboring question and gave every deterministic verdict an inspectable decision trace.</w:t>
       </w:r>
     </w:p>
     <w:p>
@@ -1390,7 +1156,7 @@
           <w:color w:val="2A8C82"/>
           <w:sz w:val="20"/>
         </w:rPr>
-        <w:t>Presenter  Joyeta Barua Moni</w:t>
+        <w:t>Presenter  MD. Abtahee Kabir</w:t>
       </w:r>
       <w:r>
         <w:rPr>
@@ -1400,7 +1166,7 @@
           <w:color w:val="D59B32"/>
           <w:sz w:val="20"/>
         </w:rPr>
-        <w:t xml:space="preserve">     Target  60 seconds</w:t>
+        <w:t xml:space="preserve">     Target  40 seconds</w:t>
       </w:r>
     </w:p>
     <w:p>
@@ -1416,7 +1182,7 @@
           <w:color w:val="0F172A"/>
           <w:sz w:val="23"/>
         </w:rPr>
-        <w:t>This table makes the evolution easier to compare, but it is not a controlled ablation because each version accumulates more than one change. The baseline scored 0.657. A uniform Qwen judge raised that to 0.797 but judged every row under one policy. v6 introduced source and structured routing and reached 0.903, the largest observed step. v37 tightened provenance and reduced the unresolved queue to 312 rows. v85 added a reproducible two-source anchor and left 193 rows. v91 required typed idiom and predicate guards, reached 0.967 publicly, and left 158 rows. The important evidence is the alignment between score movement, queue reduction, and documented architectural changes, not a claim that each row is a pure single-variable experiment.</w:t>
+        <w:t>The left curve shows public macro-F1 across selected versions; the right chart shows the shrinking judge queue. A uniform Qwen judge reached 0.797. The largest jump came with source and structured routing in v6, which reached 0.903. Later provenance and relation guards raised the score more gradually while reducing the Phase 1 judge queue from 620 early rows to 158 in v91. These are cumulative versions, not controlled single-factor ablations.</w:t>
       </w:r>
     </w:p>
     <w:p>
@@ -1446,7 +1212,7 @@
           <w:color w:val="2A8C82"/>
           <w:sz w:val="20"/>
         </w:rPr>
-        <w:t>Presenter  Joyeta Barua Moni</w:t>
+        <w:t>Presenter  MD. Abtahee Kabir</w:t>
       </w:r>
       <w:r>
         <w:rPr>
@@ -1456,7 +1222,7 @@
           <w:color w:val="D59B32"/>
           <w:sz w:val="20"/>
         </w:rPr>
-        <w:t xml:space="preserve">     Target  60 seconds</w:t>
+        <w:t xml:space="preserve">     Target  35 seconds</w:t>
       </w:r>
     </w:p>
     <w:p>
@@ -1472,20 +1238,8 @@
           <w:color w:val="0F172A"/>
           <w:sz w:val="23"/>
         </w:rPr>
-        <w:t>The decision log mattered because a failed experiment had to change the next experiment. Prompt voting looked reasonable on the released set and scored 0.783 publicly, so we stopped treating prompt variation as independent evidence. The TF-IDF verifier reached 0.826 out of fold but missed cultural facts, so we retained it only as a portable fallback. Raw retrieval often found the right entity and the wrong relation, so retrieval was restricted to proposing candidates. v87 changed two labels using plausible facts and reduced the public score from 0.966 to 0.965. We reverted it and added the source-plus-predicate admission rule. Later changes also had to preserve the regression suite and emit an evidence trace.</w:t>
+        <w:t>Failed runs changed the next hypothesis. Prompt voting was unstable, so prompt variation was not treated as independent evidence. TF-IDF missed cultural facts, so it remained only a fallback. Raw retrieval repeatedly found the correct entity but the wrong predicate, so it was restricted to candidate generation. When v87 changed plausible facts and reduced the public score, we reverted it and added the source-plus-predicate admission rule.</w:t>
       </w:r>
-    </w:p>
-    <w:p>
-      <w:pPr>
-        <w:sectPr>
-          <w:headerReference w:type="default" r:id="rId9"/>
-          <w:footerReference w:type="default" r:id="rId10"/>
-          <w:pgSz w:w="12240" w:h="15840"/>
-          <w:pgMar w:top="1181" w:right="1267" w:bottom="1123" w:left="1267" w:header="504" w:footer="504" w:gutter="0"/>
-          <w:cols w:space="720"/>
-          <w:docGrid w:linePitch="360"/>
-        </w:sectPr>
-      </w:pPr>
     </w:p>
     <w:p>
       <w:pPr>
@@ -1509,7 +1263,7 @@
           <w:color w:val="2A8C82"/>
           <w:sz w:val="20"/>
         </w:rPr>
-        <w:t>Presenter  Joyeta Barua Moni</w:t>
+        <w:t>Presenter  MD. Abtahee Kabir</w:t>
       </w:r>
       <w:r>
         <w:rPr>
@@ -1519,7 +1273,7 @@
           <w:color w:val="D59B32"/>
           <w:sz w:val="20"/>
         </w:rPr>
-        <w:t xml:space="preserve">     Target  60 seconds</w:t>
+        <w:t xml:space="preserve">     Target  40 seconds</w:t>
       </w:r>
     </w:p>
     <w:p>
@@ -1535,100 +1289,7 @@
           <w:color w:val="0F172A"/>
           <w:sz w:val="23"/>
         </w:rPr>
-        <w:t>We treated reproducibility as a result, not an administrative detail. The codebase had 249 automated tests, including 225 deterministic controls. The notebook reads the organizer's literal test path, loads pinned model, runtime, and evidence assets, and uses a fixed row, prompt, and batch schedule. One local llama.cpp server tensor-splits the model equally across the two T4 GPUs. The final validator preserves incoming IDs and writes exactly id and label. Three full runs produced byte-identical files, the frozen hash matched the scored CSV, and the organizer-run notebook validated 5,000 Phase 2 rows in 3 hours and 52 minutes. These checks establish execution integrity. The later official score measures the aggregate outcome, but it still provides no row-level errors.</w:t>
-      </w:r>
-    </w:p>
-    <w:tbl>
-      <w:tblPr>
-        <w:tblW w:type="dxa" w:w="9360"/>
-        <w:jc w:val="left"/>
-        <w:tblLayout w:type="fixed"/>
-        <w:tblLook w:firstColumn="1" w:firstRow="1" w:lastColumn="0" w:lastRow="0" w:noHBand="0" w:noVBand="1" w:val="04A0"/>
-        <w:tblInd w:w="120" w:type="dxa"/>
-      </w:tblPr>
-      <w:tblGrid>
-        <w:gridCol w:w="9360"/>
-      </w:tblGrid>
-      <w:tr>
-        <w:tc>
-          <w:tcPr>
-            <w:tcW w:type="dxa" w:w="9360"/>
-            <w:tcMar>
-              <w:top w:w="100" w:type="dxa"/>
-              <w:start w:w="120" w:type="dxa"/>
-              <w:bottom w:w="100" w:type="dxa"/>
-              <w:end w:w="120" w:type="dxa"/>
-            </w:tcMar>
-            <w:vAlign w:val="center"/>
-            <w:shd w:fill="DDF2EE"/>
-          </w:tcPr>
-          <w:p>
-            <w:pPr>
-              <w:spacing w:after="40"/>
-            </w:pPr>
-            <w:r>
-              <w:rPr>
-                <w:rFonts w:ascii="Calibri" w:hAnsi="Calibri" w:eastAsia="Calibri"/>
-                <w:b/>
-                <w:i w:val="0"/>
-                <w:color w:val="2A8C82"/>
-                <w:sz w:val="21"/>
-              </w:rPr>
-              <w:t>Handoff</w:t>
-              <w:br/>
-            </w:r>
-            <w:r>
-              <w:rPr>
-                <w:rFonts w:ascii="Calibri" w:hAnsi="Calibri" w:eastAsia="Calibri"/>
-                <w:b w:val="0"/>
-                <w:i w:val="0"/>
-                <w:color w:val="0F172A"/>
-                <w:sz w:val="21"/>
-              </w:rPr>
-              <w:t>Orny will cover the measured runtime and Phase 2 source shift.</w:t>
-            </w:r>
-          </w:p>
-        </w:tc>
-      </w:tr>
-    </w:tbl>
-    <w:p>
-      <w:pPr>
-        <w:spacing w:after="20"/>
-      </w:pPr>
-    </w:p>
-    <w:p>
-      <w:r>
-        <w:br w:type="page"/>
-      </w:r>
-    </w:p>
-    <w:p>
-      <w:pPr>
-        <w:spacing w:after="60"/>
-      </w:pPr>
-      <w:r>
-        <w:rPr>
-          <w:rFonts w:ascii="Calibri" w:hAnsi="Calibri" w:eastAsia="Calibri"/>
-          <w:b/>
-          <w:i w:val="0"/>
-          <w:color w:val="D59B32"/>
-          <w:sz w:val="20"/>
-        </w:rPr>
-        <w:t>PRESENTER BLOCK</w:t>
-      </w:r>
-    </w:p>
-    <w:p>
-      <w:pPr>
-        <w:spacing w:after="200"/>
-      </w:pPr>
-      <w:r>
-        <w:rPr>
-          <w:rFonts w:ascii="Calibri" w:hAnsi="Calibri" w:eastAsia="Calibri"/>
-          <w:b/>
-          <w:i w:val="0"/>
-          <w:color w:val="0F172A"/>
-          <w:sz w:val="44"/>
-        </w:rPr>
-        <w:t>Noore Tamanna Orny</w:t>
+        <w:t>The final notebook used pinned model, runtime, and evidence assets with a fixed schedule. The codebase had 249 automated tests, including 225 deterministic controls. Three full Phase 1 runs produced byte-identical CSVs, and the frozen output matched the scored submission. The notebook preserved incoming IDs and wrote only `id,label`. The organizer then ran the same pipeline on 5,000 Phase 2 rows without schema, ordering, or runtime failure.</w:t>
       </w:r>
     </w:p>
     <w:p>
@@ -1653,7 +1314,7 @@
           <w:color w:val="2A8C82"/>
           <w:sz w:val="20"/>
         </w:rPr>
-        <w:t>Presenter  Noore Tamanna Orny</w:t>
+        <w:t>Presenter  MD. Abtahee Kabir</w:t>
       </w:r>
       <w:r>
         <w:rPr>
@@ -1663,7 +1324,7 @@
           <w:color w:val="D59B32"/>
           <w:sz w:val="20"/>
         </w:rPr>
-        <w:t xml:space="preserve">     Target  65 seconds</w:t>
+        <w:t xml:space="preserve">     Target  40 seconds</w:t>
       </w:r>
     </w:p>
     <w:p>
@@ -1679,7 +1340,12 @@
           <w:color w:val="0F172A"/>
           <w:sz w:val="23"/>
         </w:rPr>
-        <w:t>The organizer-run Phase 2 notebook processed exactly 5,000 rows on two Tesla T4 GPUs. The router finished in 73.18 seconds but resolved only 207 rows, or 4.14 percent. The remaining 4,793 rows went to Qwen. The model was ready 171.25 seconds after the notebook started, and the judge stage took 13,747.50 seconds. End-to-end runtime was 13,921.91 seconds, which is 3 hours, 52 minutes, and 1.91 seconds. The output validation cell completed successfully with 5,000 ordered IDs and binary labels. This used 42.97 percent of the nine-hour budget. The official standings later reported a score of 0.90144 and rank 7 of 32 teams. That is an aggregate result; the organizers did not release row-level labels.</w:t>
+        <w:t>On the organizer-run 5,000-row set, the router resolved 207 rows and sent 4,793 to Qwen. End-to-end inference took 3 hours, 52 minutes, and 1.91 seconds on two T4 GPUs, using about 43 percent of the nine-hour budget. Output validation passed for all 5,000 ordered IDs. The official Phase 2 score was 0.90144, ranking seventh among 32 teams.</w:t>
+      </w:r>
+    </w:p>
+    <w:p>
+      <w:r>
+        <w:br w:type="page"/>
       </w:r>
     </w:p>
     <w:p>
@@ -1704,7 +1370,7 @@
           <w:color w:val="2A8C82"/>
           <w:sz w:val="20"/>
         </w:rPr>
-        <w:t>Presenter  Noore Tamanna Orny</w:t>
+        <w:t>Presenter  MD. Abtahee Kabir</w:t>
       </w:r>
       <w:r>
         <w:rPr>
@@ -1714,7 +1380,7 @@
           <w:color w:val="D59B32"/>
           <w:sz w:val="20"/>
         </w:rPr>
-        <w:t xml:space="preserve">     Target  60 seconds</w:t>
+        <w:t xml:space="preserve">     Target  35 seconds</w:t>
       </w:r>
     </w:p>
     <w:p>
@@ -1730,20 +1396,8 @@
           <w:color w:val="0F172A"/>
           <w:sz w:val="23"/>
         </w:rPr>
-        <w:t>Phase 2 changed the source distribution as expected. The organizer listed Common Crawl, recent newspapers, Wikipedia, Banglapedia, government service pages, Bangladesh law, NCTB textbooks, and literature. Deterministic coverage fell from 93.72 percent in Phase 1 to 4.14 percent in the held-out run. The router did not compensate by forcing approximate evidence. It abstained, and 95.86 percent of rows reached the fixed judge. That raised runtime to 3 hours and 52 minutes, but the notebook still finished with more than five hours of headroom. The official result was 0.90144 at rank 7 of 32. Because only aggregate standings were released, the remaining errors cannot yet be separated by source or routing branch.</w:t>
+        <w:t>The broader Phase 2 sources changed system behavior sharply. Deterministic coverage fell from 93.72 percent in Phase 1 to 4.14 percent. The router did not compensate by forcing approximate evidence; it abstained, so 95.86 percent of rows reached Qwen. Runtime increased but remained comfortably compliant. Because only the aggregate score was released, we cannot yet attribute the remaining errors to individual sources or branches.</w:t>
       </w:r>
-    </w:p>
-    <w:p>
-      <w:pPr>
-        <w:sectPr>
-          <w:headerReference w:type="default" r:id="rId11"/>
-          <w:footerReference w:type="default" r:id="rId12"/>
-          <w:pgSz w:w="12240" w:h="15840"/>
-          <w:pgMar w:top="1181" w:right="1267" w:bottom="1123" w:left="1267" w:header="504" w:footer="504" w:gutter="0"/>
-          <w:cols w:space="720"/>
-          <w:docGrid w:linePitch="360"/>
-        </w:sectPr>
-      </w:pPr>
     </w:p>
     <w:p>
       <w:pPr>
@@ -1767,7 +1421,7 @@
           <w:color w:val="2A8C82"/>
           <w:sz w:val="20"/>
         </w:rPr>
-        <w:t>Presenter  Noore Tamanna Orny</w:t>
+        <w:t>Presenter  MD. Abtahee Kabir</w:t>
       </w:r>
       <w:r>
         <w:rPr>
@@ -1777,7 +1431,7 @@
           <w:color w:val="D59B32"/>
           <w:sz w:val="20"/>
         </w:rPr>
-        <w:t xml:space="preserve">     Target  45 seconds</w:t>
+        <w:t xml:space="preserve">     Target  35 seconds</w:t>
       </w:r>
     </w:p>
     <w:p>
@@ -1793,14 +1447,14 @@
           <w:color w:val="0F172A"/>
           <w:sz w:val="23"/>
         </w:rPr>
-        <w:t>We will close by separating supported findings from open questions. The experiments support three design choices: task families benefit from separate policies, predicate alignment reduces relation swaps, and explicit abstention keeps the pipeline safe when deterministic coverage falls. The official Phase 2 score was 0.90144, placing Huntrix seventh among 32 teams, and the full run completed in 3 hours and 52 minutes. The limitations are equally important: we had only 299 released labels, the Phase 2 result is aggregate, and no row-level Phase 2 errors were released. If those labels become available, the next work is to inspect the judged tail, recalibrate uncertain cases, and expand licensed evidence for civic and news domains. We are ready for your questions.</w:t>
+        <w:t>Our experiments support three conclusions. Different task families benefit from different evidence policies. Predicate alignment prevents relation swaps. Explicit abstention protects the pipeline under source shift. The limitations are 299 released labels and no row-level Phase 2 feedback. With those labels, our next step would be to analyse the judged tail and expand licensed civic and news evidence. Thank you. We are ready for your questions.</w:t>
       </w:r>
     </w:p>
     <w:p>
       <w:pPr>
         <w:sectPr>
-          <w:headerReference w:type="default" r:id="rId13"/>
-          <w:footerReference w:type="default" r:id="rId14"/>
+          <w:headerReference w:type="default" r:id="rId9"/>
+          <w:footerReference w:type="default" r:id="rId10"/>
           <w:pgSz w:w="12240" w:h="15840"/>
           <w:pgMar w:top="1181" w:right="1267" w:bottom="1123" w:left="1267" w:header="504" w:footer="504" w:gutter="0"/>
           <w:cols w:space="720"/>
@@ -1855,7 +1509,7 @@
           <w:color w:val="0F172A"/>
           <w:sz w:val="21"/>
         </w:rPr>
-        <w:t>The released set had only 299 labeled rows, while Phase 2 deliberately changes the source distribution. Fine-tuning on that small set would make it easy to learn Phase 1 artifacts. Routing gave us a larger gain, preserved an interpretable abstention path, and kept inference inside the Kaggle limit.</w:t>
+        <w:t>The released set had only 299 labeled rows, while Phase 2 deliberately changed the source distribution. Fine-tuning on that small set risked learning Phase 1 artifacts. Routing produced a larger observed gain, preserved an interpretable abstention path, and kept inference inside the Kaggle limit.</w:t>
       </w:r>
     </w:p>
     <w:p>
@@ -1897,7 +1551,7 @@
           <w:color w:val="0F172A"/>
           <w:sz w:val="21"/>
         </w:rPr>
-        <w:t>It is an open multilingual model that handled Bengali factual and entailment prompts well in our local checks. The 16.332 GiB Q4_K_P checkpoint fits the two-T4 environment, and the short constrained output keeps the fallback practical.</w:t>
+        <w:t>It is an open multilingual model that handled Bengali factual and entailment prompts well in our checks. The 16.332 GiB Q4_K_P checkpoint fits the two-T4 environment, and constrained one-token output keeps the fallback practical.</w:t>
       </w:r>
     </w:p>
     <w:p>
@@ -1939,7 +1593,7 @@
           <w:color w:val="0F172A"/>
           <w:sz w:val="21"/>
         </w:rPr>
-        <w:t>No. We did not manually assign labels to test rows, use hidden labels, or call paid or closed APIs. The rules apply typed relations to public or competition-permitted evidence. A source match is allowed to decide only when the entity, value, and requested predicate agree; otherwise the system abstains.</w:t>
+        <w:t>No. We did not manually assign labels to test rows, use hidden labels, or call paid or closed APIs. A source record could decide only when its entity, value, and requested predicate agreed; otherwise the system abstained.</w:t>
       </w:r>
     </w:p>
     <w:p>
@@ -1981,7 +1635,7 @@
           <w:color w:val="0F172A"/>
           <w:sz w:val="21"/>
         </w:rPr>
-        <w:t>It processed 158 unique rows. Context rows use one view. Some no-context rows use two or three short views, with early exit on the first zero, so the request count is higher than the row count.</w:t>
+        <w:t>It processed 158 unique Phase 1 rows. Context rows used one view. Some no-context rows used two or three short views with early exit on the first zero, so the number of model requests was higher than the number of rows.</w:t>
       </w:r>
     </w:p>
     <w:p>
@@ -1997,7 +1651,7 @@
           <w:color w:val="0F172A"/>
           <w:sz w:val="24"/>
         </w:rPr>
-        <w:t>Q5. How does the system handle Phase 2 sources it has never seen?</w:t>
+        <w:t>Q5. How did the system handle unseen Phase 2 sources?</w:t>
       </w:r>
     </w:p>
     <w:p>
@@ -2023,7 +1677,7 @@
           <w:color w:val="0F172A"/>
           <w:sz w:val="21"/>
         </w:rPr>
-        <w:t>Unknown sources do not receive approximate deterministic labels. Context checks and general structured solvers still run, but lineage rules abstain unless their exact conditions are met. The unresolved row then reaches the fixed LLM judge.</w:t>
+        <w:t>Unknown sources did not receive approximate deterministic labels. Context checks and general structured solvers still ran, but lineage rules abstained unless their exact conditions were met. The unresolved row then reached the fixed LLM judge.</w:t>
       </w:r>
     </w:p>
     <w:p>
@@ -2039,7 +1693,7 @@
           <w:color w:val="0F172A"/>
           <w:sz w:val="24"/>
         </w:rPr>
-        <w:t>Q6. Why are the public and private scores different?</w:t>
+        <w:t>Q6. Why are the public and private Phase 1 scores different?</w:t>
       </w:r>
     </w:p>
     <w:p>
@@ -2065,14 +1719,14 @@
           <w:color w:val="0F172A"/>
           <w:sz w:val="21"/>
         </w:rPr>
-        <w:t>The public leaderboard evaluated only part of the test set. The private score came from the remaining held-out portion. We report both aggregate scores, but we do not infer row-level labels or error patterns from the leaderboard.</w:t>
+        <w:t>The public leaderboard evaluated only part of the test set. The private score came from the remaining held-out portion. We report both aggregate scores, but we do not infer row-level labels or error patterns from them.</w:t>
       </w:r>
     </w:p>
     <w:p>
       <w:pPr>
         <w:sectPr>
-          <w:headerReference w:type="default" r:id="rId15"/>
-          <w:footerReference w:type="default" r:id="rId16"/>
+          <w:headerReference w:type="default" r:id="rId11"/>
+          <w:footerReference w:type="default" r:id="rId12"/>
           <w:pgSz w:w="12240" w:h="15840"/>
           <w:pgMar w:top="1181" w:right="1267" w:bottom="1123" w:left="1267" w:header="504" w:footer="504" w:gutter="0"/>
           <w:cols w:space="720"/>
@@ -2421,8 +2075,8 @@
       </w:pPr>
     </w:p>
     <w:sectPr>
-      <w:headerReference w:type="default" r:id="rId17"/>
-      <w:footerReference w:type="default" r:id="rId18"/>
+      <w:headerReference w:type="default" r:id="rId13"/>
+      <w:footerReference w:type="default" r:id="rId14"/>
       <w:pgSz w:w="12240" w:h="15840"/>
       <w:pgMar w:top="1181" w:right="1267" w:bottom="1123" w:left="1267" w:header="504" w:footer="504" w:gutter="0"/>
       <w:cols w:space="720"/>
@@ -2519,64 +2173,6 @@
 </w:ftr>
 </file>
 
-<file path=word/footer4.xml><?xml version="1.0" encoding="utf-8"?>
-<w:ftr xmlns:m="http://schemas.openxmlformats.org/officeDocument/2006/math" xmlns:mc="http://schemas.openxmlformats.org/markup-compatibility/2006" xmlns:mo="http://schemas.microsoft.com/office/mac/office/2008/main" xmlns:mv="urn:schemas-microsoft-com:mac:vml" xmlns:o="urn:schemas-microsoft-com:office:office" xmlns:r="http://schemas.openxmlformats.org/officeDocument/2006/relationships" xmlns:v="urn:schemas-microsoft-com:vml" xmlns:w10="urn:schemas-microsoft-com:office:word" xmlns:w14="http://schemas.microsoft.com/office/word/2010/wordml" xmlns:w="http://schemas.openxmlformats.org/wordprocessingml/2006/main" xmlns:wne="http://schemas.microsoft.com/office/word/2006/wordml" xmlns:wp14="http://schemas.microsoft.com/office/word/2010/wordprocessingDrawing" xmlns:wp="http://schemas.openxmlformats.org/drawingml/2006/wordprocessingDrawing" xmlns:wpc="http://schemas.microsoft.com/office/word/2010/wordprocessingCanvas" xmlns:wpg="http://schemas.microsoft.com/office/word/2010/wordprocessingGroup" xmlns:wpi="http://schemas.microsoft.com/office/word/2010/wordprocessingInk" xmlns:wps="http://schemas.microsoft.com/office/word/2010/wordprocessingShape" mc:Ignorable="w14 wp14">
-  <w:p>
-    <w:pPr>
-      <w:pStyle w:val="Footer"/>
-      <w:jc w:val="right"/>
-    </w:pPr>
-    <w:r/>
-    <w:r>
-      <w:rPr>
-        <w:rFonts w:ascii="Calibri" w:hAnsi="Calibri" w:eastAsia="Calibri"/>
-        <w:b w:val="0"/>
-        <w:i w:val="0"/>
-        <w:color w:val="526174"/>
-        <w:sz w:val="18"/>
-      </w:rPr>
-      <w:t xml:space="preserve">Team Huntrix  |  </w:t>
-    </w:r>
-    <w:r>
-      <w:fldChar w:fldCharType="begin"/>
-      <w:instrText xml:space="preserve"> PAGE </w:instrText>
-      <w:fldChar w:fldCharType="separate"/>
-      <w:t>1</w:t>
-      <w:fldChar w:fldCharType="end"/>
-    </w:r>
-  </w:p>
-</w:ftr>
-</file>
-
-<file path=word/footer5.xml><?xml version="1.0" encoding="utf-8"?>
-<w:ftr xmlns:m="http://schemas.openxmlformats.org/officeDocument/2006/math" xmlns:mc="http://schemas.openxmlformats.org/markup-compatibility/2006" xmlns:mo="http://schemas.microsoft.com/office/mac/office/2008/main" xmlns:mv="urn:schemas-microsoft-com:mac:vml" xmlns:o="urn:schemas-microsoft-com:office:office" xmlns:r="http://schemas.openxmlformats.org/officeDocument/2006/relationships" xmlns:v="urn:schemas-microsoft-com:vml" xmlns:w10="urn:schemas-microsoft-com:office:word" xmlns:w14="http://schemas.microsoft.com/office/word/2010/wordml" xmlns:w="http://schemas.openxmlformats.org/wordprocessingml/2006/main" xmlns:wne="http://schemas.microsoft.com/office/word/2006/wordml" xmlns:wp14="http://schemas.microsoft.com/office/word/2010/wordprocessingDrawing" xmlns:wp="http://schemas.openxmlformats.org/drawingml/2006/wordprocessingDrawing" xmlns:wpc="http://schemas.microsoft.com/office/word/2010/wordprocessingCanvas" xmlns:wpg="http://schemas.microsoft.com/office/word/2010/wordprocessingGroup" xmlns:wpi="http://schemas.microsoft.com/office/word/2010/wordprocessingInk" xmlns:wps="http://schemas.microsoft.com/office/word/2010/wordprocessingShape" mc:Ignorable="w14 wp14">
-  <w:p>
-    <w:pPr>
-      <w:pStyle w:val="Footer"/>
-      <w:jc w:val="right"/>
-    </w:pPr>
-    <w:r/>
-    <w:r>
-      <w:rPr>
-        <w:rFonts w:ascii="Calibri" w:hAnsi="Calibri" w:eastAsia="Calibri"/>
-        <w:b w:val="0"/>
-        <w:i w:val="0"/>
-        <w:color w:val="526174"/>
-        <w:sz w:val="18"/>
-      </w:rPr>
-      <w:t xml:space="preserve">Team Huntrix  |  </w:t>
-    </w:r>
-    <w:r>
-      <w:fldChar w:fldCharType="begin"/>
-      <w:instrText xml:space="preserve"> PAGE </w:instrText>
-      <w:fldChar w:fldCharType="separate"/>
-      <w:t>1</w:t>
-      <w:fldChar w:fldCharType="end"/>
-    </w:r>
-  </w:p>
-</w:ftr>
-</file>
-
 <file path=word/header1.xml><?xml version="1.0" encoding="utf-8"?>
 <w:hdr xmlns:m="http://schemas.openxmlformats.org/officeDocument/2006/math" xmlns:mc="http://schemas.openxmlformats.org/markup-compatibility/2006" xmlns:mo="http://schemas.microsoft.com/office/mac/office/2008/main" xmlns:mv="urn:schemas-microsoft-com:mac:vml" xmlns:o="urn:schemas-microsoft-com:office:office" xmlns:r="http://schemas.openxmlformats.org/officeDocument/2006/relationships" xmlns:v="urn:schemas-microsoft-com:vml" xmlns:w10="urn:schemas-microsoft-com:office:word" xmlns:w14="http://schemas.microsoft.com/office/word/2010/wordml" xmlns:w="http://schemas.openxmlformats.org/wordprocessingml/2006/main" xmlns:wne="http://schemas.microsoft.com/office/word/2006/wordml" xmlns:wp14="http://schemas.microsoft.com/office/word/2010/wordprocessingDrawing" xmlns:wp="http://schemas.openxmlformats.org/drawingml/2006/wordprocessingDrawing" xmlns:wpc="http://schemas.microsoft.com/office/word/2010/wordprocessingCanvas" xmlns:wpg="http://schemas.microsoft.com/office/word/2010/wordprocessingGroup" xmlns:wpi="http://schemas.microsoft.com/office/word/2010/wordprocessingInk" xmlns:wps="http://schemas.microsoft.com/office/word/2010/wordprocessingShape" mc:Ignorable="w14 wp14">
   <w:p>
@@ -2626,54 +2222,6 @@
 </file>
 
 <file path=word/header3.xml><?xml version="1.0" encoding="utf-8"?>
-<w:hdr xmlns:m="http://schemas.openxmlformats.org/officeDocument/2006/math" xmlns:mc="http://schemas.openxmlformats.org/markup-compatibility/2006" xmlns:mo="http://schemas.microsoft.com/office/mac/office/2008/main" xmlns:mv="urn:schemas-microsoft-com:mac:vml" xmlns:o="urn:schemas-microsoft-com:office:office" xmlns:r="http://schemas.openxmlformats.org/officeDocument/2006/relationships" xmlns:v="urn:schemas-microsoft-com:vml" xmlns:w10="urn:schemas-microsoft-com:office:word" xmlns:w14="http://schemas.microsoft.com/office/word/2010/wordml" xmlns:w="http://schemas.openxmlformats.org/wordprocessingml/2006/main" xmlns:wne="http://schemas.microsoft.com/office/word/2006/wordml" xmlns:wp14="http://schemas.microsoft.com/office/word/2010/wordprocessingDrawing" xmlns:wp="http://schemas.openxmlformats.org/drawingml/2006/wordprocessingDrawing" xmlns:wpc="http://schemas.microsoft.com/office/word/2010/wordprocessingCanvas" xmlns:wpg="http://schemas.microsoft.com/office/word/2010/wordprocessingGroup" xmlns:wpi="http://schemas.microsoft.com/office/word/2010/wordprocessingInk" xmlns:wps="http://schemas.microsoft.com/office/word/2010/wordprocessingShape" mc:Ignorable="w14 wp14">
-  <w:p>
-    <w:pPr>
-      <w:pStyle w:val="Header"/>
-      <w:pBdr>
-        <w:bottom w:val="single" w:sz="6" w:space="3" w:color="D8E0EA"/>
-      </w:pBdr>
-    </w:pPr>
-    <w:r/>
-    <w:r>
-      <w:rPr>
-        <w:rFonts w:ascii="Calibri" w:hAnsi="Calibri" w:eastAsia="Calibri"/>
-        <w:b/>
-        <w:i w:val="0"/>
-        <w:color w:val="1F5A7A"/>
-        <w:sz w:val="18"/>
-      </w:rPr>
-      <w:t>TEAM HUNTRIX  |  FINAL PRESENTATION SCRIPT</w:t>
-    </w:r>
-  </w:p>
-</w:hdr>
-</file>
-
-<file path=word/header4.xml><?xml version="1.0" encoding="utf-8"?>
-<w:hdr xmlns:m="http://schemas.openxmlformats.org/officeDocument/2006/math" xmlns:mc="http://schemas.openxmlformats.org/markup-compatibility/2006" xmlns:mo="http://schemas.microsoft.com/office/mac/office/2008/main" xmlns:mv="urn:schemas-microsoft-com:mac:vml" xmlns:o="urn:schemas-microsoft-com:office:office" xmlns:r="http://schemas.openxmlformats.org/officeDocument/2006/relationships" xmlns:v="urn:schemas-microsoft-com:vml" xmlns:w10="urn:schemas-microsoft-com:office:word" xmlns:w14="http://schemas.microsoft.com/office/word/2010/wordml" xmlns:w="http://schemas.openxmlformats.org/wordprocessingml/2006/main" xmlns:wne="http://schemas.microsoft.com/office/word/2006/wordml" xmlns:wp14="http://schemas.microsoft.com/office/word/2010/wordprocessingDrawing" xmlns:wp="http://schemas.openxmlformats.org/drawingml/2006/wordprocessingDrawing" xmlns:wpc="http://schemas.microsoft.com/office/word/2010/wordprocessingCanvas" xmlns:wpg="http://schemas.microsoft.com/office/word/2010/wordprocessingGroup" xmlns:wpi="http://schemas.microsoft.com/office/word/2010/wordprocessingInk" xmlns:wps="http://schemas.microsoft.com/office/word/2010/wordprocessingShape" mc:Ignorable="w14 wp14">
-  <w:p>
-    <w:pPr>
-      <w:pStyle w:val="Header"/>
-      <w:pBdr>
-        <w:bottom w:val="single" w:sz="6" w:space="3" w:color="D8E0EA"/>
-      </w:pBdr>
-    </w:pPr>
-    <w:r/>
-    <w:r>
-      <w:rPr>
-        <w:rFonts w:ascii="Calibri" w:hAnsi="Calibri" w:eastAsia="Calibri"/>
-        <w:b/>
-        <w:i w:val="0"/>
-        <w:color w:val="1F5A7A"/>
-        <w:sz w:val="18"/>
-      </w:rPr>
-      <w:t>TEAM HUNTRIX  |  FINAL PRESENTATION SCRIPT</w:t>
-    </w:r>
-  </w:p>
-</w:hdr>
-</file>
-
-<file path=word/header5.xml><?xml version="1.0" encoding="utf-8"?>
 <w:hdr xmlns:m="http://schemas.openxmlformats.org/officeDocument/2006/math" xmlns:mc="http://schemas.openxmlformats.org/markup-compatibility/2006" xmlns:mo="http://schemas.microsoft.com/office/mac/office/2008/main" xmlns:mv="urn:schemas-microsoft-com:mac:vml" xmlns:o="urn:schemas-microsoft-com:office:office" xmlns:r="http://schemas.openxmlformats.org/officeDocument/2006/relationships" xmlns:v="urn:schemas-microsoft-com:vml" xmlns:w10="urn:schemas-microsoft-com:office:word" xmlns:w14="http://schemas.microsoft.com/office/word/2010/wordml" xmlns:w="http://schemas.openxmlformats.org/wordprocessingml/2006/main" xmlns:wne="http://schemas.microsoft.com/office/word/2006/wordml" xmlns:wp14="http://schemas.microsoft.com/office/word/2010/wordprocessingDrawing" xmlns:wp="http://schemas.openxmlformats.org/drawingml/2006/wordprocessingDrawing" xmlns:wpc="http://schemas.microsoft.com/office/word/2010/wordprocessingCanvas" xmlns:wpg="http://schemas.microsoft.com/office/word/2010/wordprocessingGroup" xmlns:wpi="http://schemas.microsoft.com/office/word/2010/wordprocessingInk" xmlns:wps="http://schemas.microsoft.com/office/word/2010/wordprocessingShape" mc:Ignorable="w14 wp14">
   <w:p>
     <w:pPr>

</xml_diff>